<commit_message>
feat: Major system updates and improvements
- Updated technical specification and documentation
- Enhanced gateway services with improved error handling and logging
- Added new authentication context service
- Improved database migrations and configuration
- Updated Docker configuration and deployment scripts
- Added Azure integration documentation and setup guides
- Enhanced call flow, clinic management, and provider services
- Improved Google Calendar integration and appointment handling
- Added structured logging and transaction management improvements
</commit_message>
<xml_diff>
--- a/1.docx
+++ b/1.docx
@@ -424,21 +424,12 @@
           <w:bCs/>
         </w:rPr>
       </w:pPr>
-      <w:proofErr w:type="gramStart"/>
       <w:r>
         <w:rPr>
           <w:b/>
           <w:bCs/>
         </w:rPr>
-        <w:t>Appointment</w:t>
-      </w:r>
-      <w:proofErr w:type="gramEnd"/>
-      <w:r>
-        <w:rPr>
-          <w:b/>
-          <w:bCs/>
-        </w:rPr>
-        <w:t xml:space="preserve"> CRUD operations</w:t>
+        <w:t>Appointment CRUD operations</w:t>
       </w:r>
     </w:p>
     <w:p>
@@ -951,21 +942,12 @@
           <w:bCs/>
         </w:rPr>
       </w:pPr>
-      <w:proofErr w:type="spellStart"/>
       <w:r>
         <w:rPr>
           <w:b/>
           <w:bCs/>
         </w:rPr>
-        <w:t>VNet</w:t>
-      </w:r>
-      <w:proofErr w:type="spellEnd"/>
-      <w:r>
-        <w:rPr>
-          <w:b/>
-          <w:bCs/>
-        </w:rPr>
-        <w:t> setup</w:t>
+        <w:t>VNet setup</w:t>
       </w:r>
     </w:p>
     <w:p>
@@ -1300,7 +1282,812 @@
         <w:t>Auto-upgrade logic</w:t>
       </w:r>
     </w:p>
-    <w:p/>
+    <w:p>
+      <w:pPr>
+        <w:pStyle w:val="ListParagraph"/>
+        <w:numPr>
+          <w:ilvl w:val="0"/>
+          <w:numId w:val="158"/>
+        </w:numPr>
+        <w:shd w:val="clear" w:color="auto" w:fill="0A0A0A"/>
+        <w:spacing w:after="0" w:line="285" w:lineRule="atLeast"/>
+        <w:rPr>
+          <w:rFonts w:ascii="Consolas" w:eastAsia="Times New Roman" w:hAnsi="Consolas" w:cs="Times New Roman"/>
+          <w:color w:val="D8DEE9"/>
+          <w:kern w:val="0"/>
+          <w:sz w:val="21"/>
+          <w:szCs w:val="21"/>
+          <w14:ligatures w14:val="none"/>
+        </w:rPr>
+      </w:pPr>
+      <w:r>
+        <w:rPr>
+          <w:rFonts w:ascii="Consolas" w:eastAsia="Times New Roman" w:hAnsi="Consolas" w:cs="Times New Roman"/>
+          <w:color w:val="83D6C5"/>
+          <w:kern w:val="0"/>
+          <w:sz w:val="21"/>
+          <w:szCs w:val="21"/>
+          <w14:ligatures w14:val="none"/>
+        </w:rPr>
+        <w:t>GOOGLE_CLIENT_ID</w:t>
+      </w:r>
+      <w:r>
+        <w:rPr>
+          <w:rFonts w:ascii="Consolas" w:eastAsia="Times New Roman" w:hAnsi="Consolas" w:cs="Times New Roman"/>
+          <w:color w:val="D6D6DD"/>
+          <w:kern w:val="0"/>
+          <w:sz w:val="21"/>
+          <w:szCs w:val="21"/>
+          <w14:ligatures w14:val="none"/>
+        </w:rPr>
+        <w:t>=</w:t>
+      </w:r>
+      <w:r>
+        <w:rPr>
+          <w:rFonts w:ascii="Consolas" w:eastAsia="Times New Roman" w:hAnsi="Consolas" w:cs="Times New Roman"/>
+          <w:color w:val="E394DC"/>
+          <w:kern w:val="0"/>
+          <w:sz w:val="21"/>
+          <w:szCs w:val="21"/>
+          <w14:ligatures w14:val="none"/>
+        </w:rPr>
+        <w:t>182784858615-03lp1s2iq84989j22v4mabnaomp8uco8.apps.googleusercontent.com</w:t>
+      </w:r>
+    </w:p>
+    <w:p>
+      <w:pPr>
+        <w:pStyle w:val="ListParagraph"/>
+        <w:numPr>
+          <w:ilvl w:val="0"/>
+          <w:numId w:val="158"/>
+        </w:numPr>
+        <w:shd w:val="clear" w:color="auto" w:fill="0A0A0A"/>
+        <w:spacing w:after="0" w:line="285" w:lineRule="atLeast"/>
+        <w:rPr>
+          <w:rFonts w:ascii="Consolas" w:eastAsia="Times New Roman" w:hAnsi="Consolas" w:cs="Times New Roman"/>
+          <w:color w:val="D8DEE9"/>
+          <w:kern w:val="0"/>
+          <w:sz w:val="21"/>
+          <w:szCs w:val="21"/>
+          <w14:ligatures w14:val="none"/>
+        </w:rPr>
+      </w:pPr>
+      <w:r>
+        <w:rPr>
+          <w:rFonts w:ascii="Consolas" w:eastAsia="Times New Roman" w:hAnsi="Consolas" w:cs="Times New Roman"/>
+          <w:color w:val="83D6C5"/>
+          <w:kern w:val="0"/>
+          <w:sz w:val="21"/>
+          <w:szCs w:val="21"/>
+          <w14:ligatures w14:val="none"/>
+        </w:rPr>
+        <w:t>GOOGLE_CLIENT_SECRET</w:t>
+      </w:r>
+      <w:r>
+        <w:rPr>
+          <w:rFonts w:ascii="Consolas" w:eastAsia="Times New Roman" w:hAnsi="Consolas" w:cs="Times New Roman"/>
+          <w:color w:val="D6D6DD"/>
+          <w:kern w:val="0"/>
+          <w:sz w:val="21"/>
+          <w:szCs w:val="21"/>
+          <w14:ligatures w14:val="none"/>
+        </w:rPr>
+        <w:t>=</w:t>
+      </w:r>
+      <w:r>
+        <w:rPr>
+          <w:rFonts w:ascii="Consolas" w:eastAsia="Times New Roman" w:hAnsi="Consolas" w:cs="Times New Roman"/>
+          <w:color w:val="E394DC"/>
+          <w:kern w:val="0"/>
+          <w:sz w:val="21"/>
+          <w:szCs w:val="21"/>
+          <w14:ligatures w14:val="none"/>
+        </w:rPr>
+        <w:t>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</w:t>
+      </w:r>
+    </w:p>
+    <w:p>
+      <w:pPr>
+        <w:rPr>
+          <w:b/>
+          <w:bCs/>
+        </w:rPr>
+      </w:pPr>
+    </w:p>
+    <w:p>
+      <w:pPr>
+        <w:rPr>
+          <w:b/>
+          <w:bCs/>
+        </w:rPr>
+      </w:pPr>
+      <w:r>
+        <w:rPr>
+          <w:b/>
+          <w:bCs/>
+        </w:rPr>
+        <w:t>callcenter</w:t>
+      </w:r>
+      <w:r>
+        <w:rPr>
+          <w:b/>
+          <w:bCs/>
+        </w:rPr>
+        <w:t>ai</w:t>
+      </w:r>
+      <w:r>
+        <w:rPr>
+          <w:b/>
+          <w:bCs/>
+        </w:rPr>
+        <w:t>-db.postgres.database.azure.com</w:t>
+      </w:r>
+    </w:p>
+    <w:p>
+      <w:pPr>
+        <w:rPr>
+          <w:b/>
+          <w:bCs/>
+        </w:rPr>
+      </w:pPr>
+      <w:proofErr w:type="spellStart"/>
+      <w:r>
+        <w:rPr>
+          <w:b/>
+          <w:bCs/>
+        </w:rPr>
+        <w:t>callcenteradmin</w:t>
+      </w:r>
+      <w:proofErr w:type="spellEnd"/>
+    </w:p>
+    <w:p>
+      <w:pPr>
+        <w:rPr>
+          <w:b/>
+          <w:bCs/>
+        </w:rPr>
+      </w:pPr>
+      <w:r>
+        <w:rPr>
+          <w:b/>
+          <w:bCs/>
+        </w:rPr>
+        <w:t xml:space="preserve">DB-azure password: </w:t>
+      </w:r>
+      <w:r>
+        <w:rPr>
+          <w:b/>
+          <w:bCs/>
+        </w:rPr>
+        <w:t>/8IIE674KaeShqgtHJIFTMF2u3kBzbA3rGRBXNZ/</w:t>
+      </w:r>
+      <w:proofErr w:type="spellStart"/>
+      <w:r>
+        <w:rPr>
+          <w:b/>
+          <w:bCs/>
+        </w:rPr>
+        <w:t>Jpc</w:t>
+      </w:r>
+      <w:proofErr w:type="spellEnd"/>
+      <w:r>
+        <w:rPr>
+          <w:b/>
+          <w:bCs/>
+        </w:rPr>
+        <w:t>=</w:t>
+      </w:r>
+    </w:p>
+    <w:p>
+      <w:pPr>
+        <w:rPr>
+          <w:b/>
+          <w:bCs/>
+        </w:rPr>
+      </w:pPr>
+    </w:p>
+    <w:p>
+      <w:pPr>
+        <w:rPr>
+          <w:b/>
+          <w:bCs/>
+        </w:rPr>
+      </w:pPr>
+      <w:r>
+        <w:rPr>
+          <w:b/>
+          <w:bCs/>
+        </w:rPr>
+        <w:t>ACS:</w:t>
+      </w:r>
+    </w:p>
+    <w:p>
+      <w:pPr>
+        <w:rPr>
+          <w:b/>
+          <w:bCs/>
+        </w:rPr>
+      </w:pPr>
+      <w:r>
+        <w:rPr>
+          <w:b/>
+          <w:bCs/>
+        </w:rPr>
+        <w:t>endpoint=https://callcenterai-acs.unitedstates.communication.azure.com/;accesskey=2nv9hmMci0K5XCoH9rFHcbaPO9QMGpri1xxVF7phWoEgwWTEZZOJJQQJ99BJACULyCp53NSCAAAAAZCSJEa2</w:t>
+      </w:r>
+    </w:p>
+    <w:p>
+      <w:pPr>
+        <w:rPr>
+          <w:b/>
+          <w:bCs/>
+        </w:rPr>
+      </w:pPr>
+      <w:r>
+        <w:rPr>
+          <w:b/>
+          <w:bCs/>
+        </w:rPr>
+        <w:lastRenderedPageBreak/>
+        <w:t xml:space="preserve">speech </w:t>
+      </w:r>
+      <w:proofErr w:type="gramStart"/>
+      <w:r>
+        <w:rPr>
+          <w:b/>
+          <w:bCs/>
+        </w:rPr>
+        <w:t>key :</w:t>
+      </w:r>
+      <w:proofErr w:type="gramEnd"/>
+      <w:r>
+        <w:rPr>
+          <w:b/>
+          <w:bCs/>
+        </w:rPr>
+        <w:t xml:space="preserve"> </w:t>
+      </w:r>
+      <w:r>
+        <w:rPr>
+          <w:b/>
+          <w:bCs/>
+        </w:rPr>
+        <w:t>CK6rGlUDhZpzm4RUds7kUf9QU46iFUU3eD7eoYLlj2l2rZZxhpA7JQQJ99BJACYeBjFXJ3w3AAAYACOGKcTx</w:t>
+      </w:r>
+    </w:p>
+    <w:p>
+      <w:pPr>
+        <w:rPr>
+          <w:b/>
+          <w:bCs/>
+        </w:rPr>
+      </w:pPr>
+    </w:p>
+    <w:p>
+      <w:pPr>
+        <w:rPr>
+          <w:b/>
+          <w:bCs/>
+        </w:rPr>
+      </w:pPr>
+      <w:proofErr w:type="spellStart"/>
+      <w:r>
+        <w:rPr>
+          <w:b/>
+          <w:bCs/>
+        </w:rPr>
+        <w:t>openai</w:t>
+      </w:r>
+      <w:proofErr w:type="spellEnd"/>
+      <w:r>
+        <w:rPr>
+          <w:b/>
+          <w:bCs/>
+        </w:rPr>
+        <w:t xml:space="preserve"> key: </w:t>
+      </w:r>
+      <w:r>
+        <w:rPr>
+          <w:b/>
+          <w:bCs/>
+        </w:rPr>
+        <w:t>GJB79S0blM4uYfkVJAPJIBZ7sC3VO2nypmqqajmOLGVw063zybcFJQQJ99BJACYeBjFXJ3w3AAABACOGp0OA</w:t>
+      </w:r>
+    </w:p>
+    <w:p>
+      <w:pPr>
+        <w:rPr>
+          <w:b/>
+          <w:bCs/>
+        </w:rPr>
+      </w:pPr>
+    </w:p>
+    <w:p>
+      <w:pPr>
+        <w:rPr>
+          <w:b/>
+          <w:bCs/>
+        </w:rPr>
+      </w:pPr>
+      <w:proofErr w:type="spellStart"/>
+      <w:r>
+        <w:rPr>
+          <w:b/>
+          <w:bCs/>
+        </w:rPr>
+        <w:t>openai</w:t>
+      </w:r>
+      <w:proofErr w:type="spellEnd"/>
+      <w:r>
+        <w:rPr>
+          <w:b/>
+          <w:bCs/>
+        </w:rPr>
+        <w:t xml:space="preserve"> endpoint: </w:t>
+      </w:r>
+      <w:hyperlink r:id="rId5" w:history="1">
+        <w:r>
+          <w:rPr>
+            <w:rStyle w:val="Hyperlink"/>
+            <w:b/>
+            <w:bCs/>
+          </w:rPr>
+          <w:t>https://callcenterai-openai.openai.azure.com/</w:t>
+        </w:r>
+      </w:hyperlink>
+    </w:p>
+    <w:p>
+      <w:pPr>
+        <w:rPr>
+          <w:b/>
+          <w:bCs/>
+        </w:rPr>
+      </w:pPr>
+    </w:p>
+    <w:p>
+      <w:pPr>
+        <w:rPr>
+          <w:b/>
+          <w:bCs/>
+        </w:rPr>
+      </w:pPr>
+      <w:r>
+        <w:rPr>
+          <w:b/>
+          <w:bCs/>
+        </w:rPr>
+        <w:t># Build and push the updated image to ACR</w:t>
+      </w:r>
+    </w:p>
+    <w:p>
+      <w:pPr>
+        <w:rPr>
+          <w:b/>
+          <w:bCs/>
+        </w:rPr>
+      </w:pPr>
+      <w:proofErr w:type="spellStart"/>
+      <w:r>
+        <w:rPr>
+          <w:b/>
+          <w:bCs/>
+        </w:rPr>
+        <w:t>az</w:t>
+      </w:r>
+      <w:proofErr w:type="spellEnd"/>
+      <w:r>
+        <w:rPr>
+          <w:b/>
+          <w:bCs/>
+        </w:rPr>
+        <w:t xml:space="preserve"> </w:t>
+      </w:r>
+      <w:proofErr w:type="spellStart"/>
+      <w:r>
+        <w:rPr>
+          <w:b/>
+          <w:bCs/>
+        </w:rPr>
+        <w:t>acr</w:t>
+      </w:r>
+      <w:proofErr w:type="spellEnd"/>
+      <w:r>
+        <w:rPr>
+          <w:b/>
+          <w:bCs/>
+        </w:rPr>
+        <w:t xml:space="preserve"> build --registry </w:t>
+      </w:r>
+      <w:proofErr w:type="spellStart"/>
+      <w:r>
+        <w:rPr>
+          <w:b/>
+          <w:bCs/>
+        </w:rPr>
+        <w:t>callcenteracr</w:t>
+      </w:r>
+      <w:proofErr w:type="spellEnd"/>
+      <w:r>
+        <w:rPr>
+          <w:b/>
+          <w:bCs/>
+        </w:rPr>
+        <w:t xml:space="preserve"> --image </w:t>
+      </w:r>
+      <w:proofErr w:type="spellStart"/>
+      <w:r>
+        <w:rPr>
+          <w:b/>
+          <w:bCs/>
+        </w:rPr>
+        <w:t>callcenter-</w:t>
+      </w:r>
+      <w:proofErr w:type="gramStart"/>
+      <w:r>
+        <w:rPr>
+          <w:b/>
+          <w:bCs/>
+        </w:rPr>
+        <w:t>gateway:latest</w:t>
+      </w:r>
+      <w:proofErr w:type="spellEnd"/>
+      <w:proofErr w:type="gramEnd"/>
+      <w:r>
+        <w:rPr>
+          <w:b/>
+          <w:bCs/>
+        </w:rPr>
+        <w:t xml:space="preserve"> ./gateway/</w:t>
+      </w:r>
+    </w:p>
+    <w:p>
+      <w:pPr>
+        <w:rPr>
+          <w:b/>
+          <w:bCs/>
+        </w:rPr>
+      </w:pPr>
+    </w:p>
+    <w:p>
+      <w:pPr>
+        <w:rPr>
+          <w:b/>
+          <w:bCs/>
+        </w:rPr>
+      </w:pPr>
+      <w:r>
+        <w:rPr>
+          <w:b/>
+          <w:bCs/>
+        </w:rPr>
+        <w:t># Delete the existing container instance</w:t>
+      </w:r>
+    </w:p>
+    <w:p>
+      <w:pPr>
+        <w:rPr>
+          <w:b/>
+          <w:bCs/>
+        </w:rPr>
+      </w:pPr>
+      <w:proofErr w:type="spellStart"/>
+      <w:r>
+        <w:rPr>
+          <w:b/>
+          <w:bCs/>
+        </w:rPr>
+        <w:t>az</w:t>
+      </w:r>
+      <w:proofErr w:type="spellEnd"/>
+      <w:r>
+        <w:rPr>
+          <w:b/>
+          <w:bCs/>
+        </w:rPr>
+        <w:t xml:space="preserve"> container delete --resource-group </w:t>
+      </w:r>
+      <w:proofErr w:type="spellStart"/>
+      <w:r>
+        <w:rPr>
+          <w:b/>
+          <w:bCs/>
+        </w:rPr>
+        <w:t>CallCenterAi</w:t>
+      </w:r>
+      <w:proofErr w:type="spellEnd"/>
+      <w:r>
+        <w:rPr>
+          <w:b/>
+          <w:bCs/>
+        </w:rPr>
+        <w:t xml:space="preserve">-Test --name </w:t>
+      </w:r>
+      <w:proofErr w:type="spellStart"/>
+      <w:r>
+        <w:rPr>
+          <w:b/>
+          <w:bCs/>
+        </w:rPr>
+        <w:t>callcenterai</w:t>
+      </w:r>
+      <w:proofErr w:type="spellEnd"/>
+      <w:r>
+        <w:rPr>
+          <w:b/>
+          <w:bCs/>
+        </w:rPr>
+        <w:t xml:space="preserve">-gateway </w:t>
+      </w:r>
+      <w:r>
+        <w:rPr>
+          <w:b/>
+          <w:bCs/>
+        </w:rPr>
+        <w:t>–</w:t>
+      </w:r>
+      <w:r>
+        <w:rPr>
+          <w:b/>
+          <w:bCs/>
+        </w:rPr>
+        <w:t>yes</w:t>
+      </w:r>
+    </w:p>
+    <w:p>
+      <w:pPr>
+        <w:rPr>
+          <w:b/>
+          <w:bCs/>
+        </w:rPr>
+      </w:pPr>
+    </w:p>
+    <w:p>
+      <w:pPr>
+        <w:rPr>
+          <w:b/>
+          <w:bCs/>
+        </w:rPr>
+      </w:pPr>
+      <w:r>
+        <w:rPr>
+          <w:b/>
+          <w:bCs/>
+        </w:rPr>
+        <w:t># Check container status</w:t>
+      </w:r>
+    </w:p>
+    <w:p>
+      <w:pPr>
+        <w:rPr>
+          <w:b/>
+          <w:bCs/>
+        </w:rPr>
+      </w:pPr>
+      <w:proofErr w:type="spellStart"/>
+      <w:r>
+        <w:rPr>
+          <w:b/>
+          <w:bCs/>
+        </w:rPr>
+        <w:t>az</w:t>
+      </w:r>
+      <w:proofErr w:type="spellEnd"/>
+      <w:r>
+        <w:rPr>
+          <w:b/>
+          <w:bCs/>
+        </w:rPr>
+        <w:t xml:space="preserve"> container show --resource-group </w:t>
+      </w:r>
+      <w:proofErr w:type="spellStart"/>
+      <w:r>
+        <w:rPr>
+          <w:b/>
+          <w:bCs/>
+        </w:rPr>
+        <w:t>CallCenterAi</w:t>
+      </w:r>
+      <w:proofErr w:type="spellEnd"/>
+      <w:r>
+        <w:rPr>
+          <w:b/>
+          <w:bCs/>
+        </w:rPr>
+        <w:t xml:space="preserve">-Test --name </w:t>
+      </w:r>
+      <w:proofErr w:type="spellStart"/>
+      <w:r>
+        <w:rPr>
+          <w:b/>
+          <w:bCs/>
+        </w:rPr>
+        <w:t>callcenterai</w:t>
+      </w:r>
+      <w:proofErr w:type="spellEnd"/>
+      <w:r>
+        <w:rPr>
+          <w:b/>
+          <w:bCs/>
+        </w:rPr>
+        <w:t xml:space="preserve">-gateway --query </w:t>
+      </w:r>
+      <w:proofErr w:type="spellStart"/>
+      <w:r>
+        <w:rPr>
+          <w:b/>
+          <w:bCs/>
+        </w:rPr>
+        <w:t>instanceView.state</w:t>
+      </w:r>
+      <w:proofErr w:type="spellEnd"/>
+    </w:p>
+    <w:p>
+      <w:pPr>
+        <w:rPr>
+          <w:b/>
+          <w:bCs/>
+        </w:rPr>
+      </w:pPr>
+    </w:p>
+    <w:p>
+      <w:pPr>
+        <w:rPr>
+          <w:b/>
+          <w:bCs/>
+        </w:rPr>
+      </w:pPr>
+      <w:r>
+        <w:rPr>
+          <w:b/>
+          <w:bCs/>
+        </w:rPr>
+        <w:t># Get container logs</w:t>
+      </w:r>
+    </w:p>
+    <w:p>
+      <w:pPr>
+        <w:rPr>
+          <w:b/>
+          <w:bCs/>
+        </w:rPr>
+      </w:pPr>
+      <w:proofErr w:type="spellStart"/>
+      <w:r>
+        <w:rPr>
+          <w:b/>
+          <w:bCs/>
+        </w:rPr>
+        <w:t>az</w:t>
+      </w:r>
+      <w:proofErr w:type="spellEnd"/>
+      <w:r>
+        <w:rPr>
+          <w:b/>
+          <w:bCs/>
+        </w:rPr>
+        <w:t xml:space="preserve"> container logs --resource-group </w:t>
+      </w:r>
+      <w:proofErr w:type="spellStart"/>
+      <w:r>
+        <w:rPr>
+          <w:b/>
+          <w:bCs/>
+        </w:rPr>
+        <w:t>CallCenterAi</w:t>
+      </w:r>
+      <w:proofErr w:type="spellEnd"/>
+      <w:r>
+        <w:rPr>
+          <w:b/>
+          <w:bCs/>
+        </w:rPr>
+        <w:t xml:space="preserve">-Test --name </w:t>
+      </w:r>
+      <w:proofErr w:type="spellStart"/>
+      <w:r>
+        <w:rPr>
+          <w:b/>
+          <w:bCs/>
+        </w:rPr>
+        <w:t>callcenterai</w:t>
+      </w:r>
+      <w:proofErr w:type="spellEnd"/>
+      <w:r>
+        <w:rPr>
+          <w:b/>
+          <w:bCs/>
+        </w:rPr>
+        <w:t>-gateway</w:t>
+      </w:r>
+    </w:p>
+    <w:p>
+      <w:pPr>
+        <w:rPr>
+          <w:b/>
+          <w:bCs/>
+        </w:rPr>
+      </w:pPr>
+    </w:p>
+    <w:p>
+      <w:pPr>
+        <w:rPr>
+          <w:b/>
+          <w:bCs/>
+        </w:rPr>
+      </w:pPr>
+      <w:r>
+        <w:rPr>
+          <w:b/>
+          <w:bCs/>
+        </w:rPr>
+        <w:t># Get container IP address</w:t>
+      </w:r>
+    </w:p>
+    <w:p>
+      <w:pPr>
+        <w:rPr>
+          <w:b/>
+          <w:bCs/>
+        </w:rPr>
+      </w:pPr>
+      <w:proofErr w:type="spellStart"/>
+      <w:r>
+        <w:rPr>
+          <w:b/>
+          <w:bCs/>
+        </w:rPr>
+        <w:t>az</w:t>
+      </w:r>
+      <w:proofErr w:type="spellEnd"/>
+      <w:r>
+        <w:rPr>
+          <w:b/>
+          <w:bCs/>
+        </w:rPr>
+        <w:t xml:space="preserve"> container show --resource-group </w:t>
+      </w:r>
+      <w:proofErr w:type="spellStart"/>
+      <w:r>
+        <w:rPr>
+          <w:b/>
+          <w:bCs/>
+        </w:rPr>
+        <w:t>CallCenterAi</w:t>
+      </w:r>
+      <w:proofErr w:type="spellEnd"/>
+      <w:r>
+        <w:rPr>
+          <w:b/>
+          <w:bCs/>
+        </w:rPr>
+        <w:t xml:space="preserve">-Test --name </w:t>
+      </w:r>
+      <w:proofErr w:type="spellStart"/>
+      <w:r>
+        <w:rPr>
+          <w:b/>
+          <w:bCs/>
+        </w:rPr>
+        <w:t>callcenterai</w:t>
+      </w:r>
+      <w:proofErr w:type="spellEnd"/>
+      <w:r>
+        <w:rPr>
+          <w:b/>
+          <w:bCs/>
+        </w:rPr>
+        <w:t xml:space="preserve">-gateway --query </w:t>
+      </w:r>
+      <w:proofErr w:type="spellStart"/>
+      <w:r>
+        <w:rPr>
+          <w:b/>
+          <w:bCs/>
+        </w:rPr>
+        <w:t>ipAddress.ip</w:t>
+      </w:r>
+      <w:proofErr w:type="spellEnd"/>
+    </w:p>
     <w:sectPr>
       <w:pgSz w:w="12240" w:h="15840"/>
       <w:pgMar w:top="1440" w:right="1440" w:bottom="1440" w:left="1440" w:header="720" w:footer="720" w:gutter="0"/>
@@ -24409,6 +25196,29 @@
       <w:spacing w:val="5"/>
     </w:rPr>
   </w:style>
+  <w:style w:type="character" w:styleId="Hyperlink">
+    <w:name w:val="Hyperlink"/>
+    <w:basedOn w:val="DefaultParagraphFont"/>
+    <w:uiPriority w:val="99"/>
+    <w:unhideWhenUsed/>
+    <w:rsid w:val="00F2001B"/>
+    <w:rPr>
+      <w:color w:val="467886" w:themeColor="hyperlink"/>
+      <w:u w:val="single"/>
+    </w:rPr>
+  </w:style>
+  <w:style w:type="character" w:styleId="UnresolvedMention">
+    <w:name w:val="Unresolved Mention"/>
+    <w:basedOn w:val="DefaultParagraphFont"/>
+    <w:uiPriority w:val="99"/>
+    <w:semiHidden/>
+    <w:unhideWhenUsed/>
+    <w:rsid w:val="00F2001B"/>
+    <w:rPr>
+      <w:color w:val="605E5C"/>
+      <w:shd w:val="clear" w:color="auto" w:fill="E1DFDD"/>
+    </w:rPr>
+  </w:style>
 </w:styles>
 </file>
 

</xml_diff>

<commit_message>
Refactor: Remove redundant exception handling and standardize route patterns
- Removed redundant try/except blocks from route files (global handler handles exceptions)
- Added Path() validation for all path parameters
- Fixed datetime path parameter parsing in providers.py
- Standardized error handling across all route files
- Removed unused imports and cleaned up code
- Simplified exception handling (removed duplicate handlers)
- Converted ValueError to ValidationError for consistency

Files refactored:
- gateway/routes/providers.py
- gateway/routes/reminders.py
- gateway/routes/tokens.py

This reduces code bloat and improves maintainability by leveraging the global exception handler.
</commit_message>
<xml_diff>
--- a/1.docx
+++ b/1.docx
@@ -1430,7 +1430,6 @@
           <w:bCs/>
         </w:rPr>
       </w:pPr>
-      <w:proofErr w:type="spellStart"/>
       <w:r>
         <w:rPr>
           <w:b/>
@@ -1438,7 +1437,6 @@
         </w:rPr>
         <w:t>callcenteradmin</w:t>
       </w:r>
-      <w:proofErr w:type="spellEnd"/>
     </w:p>
     <w:p>
       <w:pPr>
@@ -1459,23 +1457,7 @@
           <w:b/>
           <w:bCs/>
         </w:rPr>
-        <w:t>/8IIE674KaeShqgtHJIFTMF2u3kBzbA3rGRBXNZ/</w:t>
-      </w:r>
-      <w:proofErr w:type="spellStart"/>
-      <w:r>
-        <w:rPr>
-          <w:b/>
-          <w:bCs/>
-        </w:rPr>
-        <w:t>Jpc</w:t>
-      </w:r>
-      <w:proofErr w:type="spellEnd"/>
-      <w:r>
-        <w:rPr>
-          <w:b/>
-          <w:bCs/>
-        </w:rPr>
-        <w:t>=</w:t>
+        <w:t>/8IIE674KaeShqgtHJIFTMF2u3kBzbA3rGRBXNZ/Jpc=</w:t>
       </w:r>
     </w:p>
     <w:p>
@@ -1529,23 +1511,7 @@
           <w:bCs/>
         </w:rPr>
         <w:lastRenderedPageBreak/>
-        <w:t xml:space="preserve">speech </w:t>
-      </w:r>
-      <w:proofErr w:type="gramStart"/>
-      <w:r>
-        <w:rPr>
-          <w:b/>
-          <w:bCs/>
-        </w:rPr>
-        <w:t>key :</w:t>
-      </w:r>
-      <w:proofErr w:type="gramEnd"/>
-      <w:r>
-        <w:rPr>
-          <w:b/>
-          <w:bCs/>
-        </w:rPr>
-        <w:t xml:space="preserve"> </w:t>
+        <w:t xml:space="preserve">speech key : </w:t>
       </w:r>
       <w:r>
         <w:rPr>
@@ -1570,21 +1536,12 @@
           <w:bCs/>
         </w:rPr>
       </w:pPr>
-      <w:proofErr w:type="spellStart"/>
       <w:r>
         <w:rPr>
           <w:b/>
           <w:bCs/>
         </w:rPr>
-        <w:t>openai</w:t>
-      </w:r>
-      <w:proofErr w:type="spellEnd"/>
-      <w:r>
-        <w:rPr>
-          <w:b/>
-          <w:bCs/>
-        </w:rPr>
-        <w:t xml:space="preserve"> key: </w:t>
+        <w:t xml:space="preserve">openai key: </w:t>
       </w:r>
       <w:r>
         <w:rPr>
@@ -1609,21 +1566,12 @@
           <w:bCs/>
         </w:rPr>
       </w:pPr>
-      <w:proofErr w:type="spellStart"/>
       <w:r>
         <w:rPr>
           <w:b/>
           <w:bCs/>
         </w:rPr>
-        <w:t>openai</w:t>
-      </w:r>
-      <w:proofErr w:type="spellEnd"/>
-      <w:r>
-        <w:rPr>
-          <w:b/>
-          <w:bCs/>
-        </w:rPr>
-        <w:t xml:space="preserve"> endpoint: </w:t>
+        <w:t xml:space="preserve">openai endpoint: </w:t>
       </w:r>
       <w:hyperlink r:id="rId5" w:history="1">
         <w:r>
@@ -1666,78 +1614,12 @@
           <w:bCs/>
         </w:rPr>
       </w:pPr>
-      <w:proofErr w:type="spellStart"/>
       <w:r>
         <w:rPr>
           <w:b/>
           <w:bCs/>
         </w:rPr>
-        <w:t>az</w:t>
-      </w:r>
-      <w:proofErr w:type="spellEnd"/>
-      <w:r>
-        <w:rPr>
-          <w:b/>
-          <w:bCs/>
-        </w:rPr>
-        <w:t xml:space="preserve"> </w:t>
-      </w:r>
-      <w:proofErr w:type="spellStart"/>
-      <w:r>
-        <w:rPr>
-          <w:b/>
-          <w:bCs/>
-        </w:rPr>
-        <w:t>acr</w:t>
-      </w:r>
-      <w:proofErr w:type="spellEnd"/>
-      <w:r>
-        <w:rPr>
-          <w:b/>
-          <w:bCs/>
-        </w:rPr>
-        <w:t xml:space="preserve"> build --registry </w:t>
-      </w:r>
-      <w:proofErr w:type="spellStart"/>
-      <w:r>
-        <w:rPr>
-          <w:b/>
-          <w:bCs/>
-        </w:rPr>
-        <w:t>callcenteracr</w:t>
-      </w:r>
-      <w:proofErr w:type="spellEnd"/>
-      <w:r>
-        <w:rPr>
-          <w:b/>
-          <w:bCs/>
-        </w:rPr>
-        <w:t xml:space="preserve"> --image </w:t>
-      </w:r>
-      <w:proofErr w:type="spellStart"/>
-      <w:r>
-        <w:rPr>
-          <w:b/>
-          <w:bCs/>
-        </w:rPr>
-        <w:t>callcenter-</w:t>
-      </w:r>
-      <w:proofErr w:type="gramStart"/>
-      <w:r>
-        <w:rPr>
-          <w:b/>
-          <w:bCs/>
-        </w:rPr>
-        <w:t>gateway:latest</w:t>
-      </w:r>
-      <w:proofErr w:type="spellEnd"/>
-      <w:proofErr w:type="gramEnd"/>
-      <w:r>
-        <w:rPr>
-          <w:b/>
-          <w:bCs/>
-        </w:rPr>
-        <w:t xml:space="preserve"> ./gateway/</w:t>
+        <w:t>az acr build --registry callcenteracr --image callcenter-gateway:latest ./gateway/</w:t>
       </w:r>
     </w:p>
     <w:p>
@@ -1770,53 +1652,12 @@
           <w:bCs/>
         </w:rPr>
       </w:pPr>
-      <w:proofErr w:type="spellStart"/>
       <w:r>
         <w:rPr>
           <w:b/>
           <w:bCs/>
         </w:rPr>
-        <w:t>az</w:t>
-      </w:r>
-      <w:proofErr w:type="spellEnd"/>
-      <w:r>
-        <w:rPr>
-          <w:b/>
-          <w:bCs/>
-        </w:rPr>
-        <w:t xml:space="preserve"> container delete --resource-group </w:t>
-      </w:r>
-      <w:proofErr w:type="spellStart"/>
-      <w:r>
-        <w:rPr>
-          <w:b/>
-          <w:bCs/>
-        </w:rPr>
-        <w:t>CallCenterAi</w:t>
-      </w:r>
-      <w:proofErr w:type="spellEnd"/>
-      <w:r>
-        <w:rPr>
-          <w:b/>
-          <w:bCs/>
-        </w:rPr>
-        <w:t xml:space="preserve">-Test --name </w:t>
-      </w:r>
-      <w:proofErr w:type="spellStart"/>
-      <w:r>
-        <w:rPr>
-          <w:b/>
-          <w:bCs/>
-        </w:rPr>
-        <w:t>callcenterai</w:t>
-      </w:r>
-      <w:proofErr w:type="spellEnd"/>
-      <w:r>
-        <w:rPr>
-          <w:b/>
-          <w:bCs/>
-        </w:rPr>
-        <w:t xml:space="preserve">-gateway </w:t>
+        <w:t xml:space="preserve">az container delete --resource-group CallCenterAi-Test --name callcenterai-gateway </w:t>
       </w:r>
       <w:r>
         <w:rPr>
@@ -1863,63 +1704,13 @@
           <w:bCs/>
         </w:rPr>
       </w:pPr>
-      <w:proofErr w:type="spellStart"/>
       <w:r>
         <w:rPr>
           <w:b/>
           <w:bCs/>
         </w:rPr>
-        <w:t>az</w:t>
+        <w:t>az container show --resource-group CallCenterAi-Test --name callcenterai-gateway --query instanceView.state</w:t>
       </w:r>
-      <w:proofErr w:type="spellEnd"/>
-      <w:r>
-        <w:rPr>
-          <w:b/>
-          <w:bCs/>
-        </w:rPr>
-        <w:t xml:space="preserve"> container show --resource-group </w:t>
-      </w:r>
-      <w:proofErr w:type="spellStart"/>
-      <w:r>
-        <w:rPr>
-          <w:b/>
-          <w:bCs/>
-        </w:rPr>
-        <w:t>CallCenterAi</w:t>
-      </w:r>
-      <w:proofErr w:type="spellEnd"/>
-      <w:r>
-        <w:rPr>
-          <w:b/>
-          <w:bCs/>
-        </w:rPr>
-        <w:t xml:space="preserve">-Test --name </w:t>
-      </w:r>
-      <w:proofErr w:type="spellStart"/>
-      <w:r>
-        <w:rPr>
-          <w:b/>
-          <w:bCs/>
-        </w:rPr>
-        <w:t>callcenterai</w:t>
-      </w:r>
-      <w:proofErr w:type="spellEnd"/>
-      <w:r>
-        <w:rPr>
-          <w:b/>
-          <w:bCs/>
-        </w:rPr>
-        <w:t xml:space="preserve">-gateway --query </w:t>
-      </w:r>
-      <w:proofErr w:type="spellStart"/>
-      <w:r>
-        <w:rPr>
-          <w:b/>
-          <w:bCs/>
-        </w:rPr>
-        <w:t>instanceView.state</w:t>
-      </w:r>
-      <w:proofErr w:type="spellEnd"/>
     </w:p>
     <w:p>
       <w:pPr>
@@ -1951,53 +1742,12 @@
           <w:bCs/>
         </w:rPr>
       </w:pPr>
-      <w:proofErr w:type="spellStart"/>
       <w:r>
         <w:rPr>
           <w:b/>
           <w:bCs/>
         </w:rPr>
-        <w:t>az</w:t>
-      </w:r>
-      <w:proofErr w:type="spellEnd"/>
-      <w:r>
-        <w:rPr>
-          <w:b/>
-          <w:bCs/>
-        </w:rPr>
-        <w:t xml:space="preserve"> container logs --resource-group </w:t>
-      </w:r>
-      <w:proofErr w:type="spellStart"/>
-      <w:r>
-        <w:rPr>
-          <w:b/>
-          <w:bCs/>
-        </w:rPr>
-        <w:t>CallCenterAi</w:t>
-      </w:r>
-      <w:proofErr w:type="spellEnd"/>
-      <w:r>
-        <w:rPr>
-          <w:b/>
-          <w:bCs/>
-        </w:rPr>
-        <w:t xml:space="preserve">-Test --name </w:t>
-      </w:r>
-      <w:proofErr w:type="spellStart"/>
-      <w:r>
-        <w:rPr>
-          <w:b/>
-          <w:bCs/>
-        </w:rPr>
-        <w:t>callcenterai</w:t>
-      </w:r>
-      <w:proofErr w:type="spellEnd"/>
-      <w:r>
-        <w:rPr>
-          <w:b/>
-          <w:bCs/>
-        </w:rPr>
-        <w:t>-gateway</w:t>
+        <w:t>az container logs --resource-group CallCenterAi-Test --name callcenterai-gateway</w:t>
       </w:r>
     </w:p>
     <w:p>
@@ -2030,63 +1780,66 @@
           <w:bCs/>
         </w:rPr>
       </w:pPr>
-      <w:proofErr w:type="spellStart"/>
       <w:r>
         <w:rPr>
           <w:b/>
           <w:bCs/>
         </w:rPr>
-        <w:t>az</w:t>
+        <w:t>az container show --resource-group CallCenterAi-Test --name callcenterai-gateway --query ipAddress.ip</w:t>
       </w:r>
-      <w:proofErr w:type="spellEnd"/>
+    </w:p>
+    <w:p>
+      <w:pPr>
+        <w:rPr>
+          <w:b/>
+          <w:bCs/>
+        </w:rPr>
+      </w:pPr>
+    </w:p>
+    <w:p>
+      <w:pPr>
+        <w:rPr>
+          <w:b/>
+          <w:bCs/>
+        </w:rPr>
+      </w:pPr>
+    </w:p>
+    <w:p>
+      <w:pPr>
+        <w:rPr>
+          <w:b/>
+          <w:bCs/>
+        </w:rPr>
+      </w:pPr>
       <w:r>
         <w:rPr>
           <w:b/>
           <w:bCs/>
         </w:rPr>
-        <w:t xml:space="preserve"> container show --resource-group </w:t>
+        <w:t xml:space="preserve">az container exec -g CallCenterAi-Test -n callcenter-gateway </w:t>
       </w:r>
-      <w:proofErr w:type="spellStart"/>
       <w:r>
         <w:rPr>
           <w:b/>
           <w:bCs/>
         </w:rPr>
-        <w:t>CallCenterAi</w:t>
+        <w:t>`</w:t>
       </w:r>
-      <w:proofErr w:type="spellEnd"/>
+    </w:p>
+    <w:p>
+      <w:pPr>
+        <w:rPr>
+          <w:b/>
+          <w:bCs/>
+        </w:rPr>
+      </w:pPr>
       <w:r>
         <w:rPr>
           <w:b/>
           <w:bCs/>
         </w:rPr>
-        <w:t xml:space="preserve">-Test --name </w:t>
+        <w:t xml:space="preserve">  --exec-command "/bin/sh -lc 'echo EXEC_OK; printenv | grep DB_'"</w:t>
       </w:r>
-      <w:proofErr w:type="spellStart"/>
-      <w:r>
-        <w:rPr>
-          <w:b/>
-          <w:bCs/>
-        </w:rPr>
-        <w:t>callcenterai</w:t>
-      </w:r>
-      <w:proofErr w:type="spellEnd"/>
-      <w:r>
-        <w:rPr>
-          <w:b/>
-          <w:bCs/>
-        </w:rPr>
-        <w:t xml:space="preserve">-gateway --query </w:t>
-      </w:r>
-      <w:proofErr w:type="spellStart"/>
-      <w:r>
-        <w:rPr>
-          <w:b/>
-          <w:bCs/>
-        </w:rPr>
-        <w:t>ipAddress.ip</w:t>
-      </w:r>
-      <w:proofErr w:type="spellEnd"/>
     </w:p>
     <w:sectPr>
       <w:pgSz w:w="12240" w:h="15840"/>
@@ -24883,6 +24636,7 @@
   <w:style w:type="character" w:default="1" w:styleId="DefaultParagraphFont">
     <w:name w:val="Default Paragraph Font"/>
     <w:uiPriority w:val="1"/>
+    <w:semiHidden/>
     <w:unhideWhenUsed/>
   </w:style>
   <w:style w:type="table" w:default="1" w:styleId="TableNormal">

</xml_diff>